<commit_message>
Alinear entregables con el portafolio: comisión de 12 %, equilibrio ≈ 57 trabajos, 662,000 hogares, pregunta final de Idear y perfil del usuario completo
Co-Authored-By: Claude Opus 5.5 <noreply@anthropic.com>
</commit_message>
<xml_diff>
--- a/docs/Handyman_Cifras_Oficiales.docx
+++ b/docs/Handyman_Cifras_Oficiales.docx
@@ -249,7 +249,7 @@
                 <w:sz w:val="19"/>
                 <w:szCs w:val="19"/>
               </w:rPr>
-              <w:t xml:space="preserve">10 % del trabajo</w:t>
+              <w:t xml:space="preserve">12 % del trabajo</w:t>
             </w:r>
           </w:p>
         </w:tc>
@@ -671,7 +671,7 @@
                 <w:sz w:val="19"/>
                 <w:szCs w:val="19"/>
               </w:rPr>
-              <w:t xml:space="preserve">Q 900</w:t>
+              <w:t xml:space="preserve">Q 880</w:t>
             </w:r>
           </w:p>
         </w:tc>
@@ -704,7 +704,7 @@
                 <w:sz w:val="19"/>
                 <w:szCs w:val="19"/>
               </w:rPr>
-              <w:t xml:space="preserve">Q 1,000 − 10 %</w:t>
+              <w:t xml:space="preserve">Q 1,000 − 12 %</w:t>
             </w:r>
           </w:p>
         </w:tc>
@@ -777,7 +777,7 @@
                 <w:sz w:val="19"/>
                 <w:szCs w:val="19"/>
               </w:rPr>
-              <w:t xml:space="preserve">Q 115 por trabajo</w:t>
+              <w:t xml:space="preserve">Q 135 por trabajo</w:t>
             </w:r>
           </w:p>
         </w:tc>
@@ -811,7 +811,7 @@
                 <w:sz w:val="19"/>
                 <w:szCs w:val="19"/>
               </w:rPr>
-              <w:t xml:space="preserve">Q 100 de comisión + Q 15 de tarifa</w:t>
+              <w:t xml:space="preserve">Q 120 de comisión + Q 15 de tarifa</w:t>
             </w:r>
           </w:p>
         </w:tc>
@@ -1093,7 +1093,7 @@
                 <w:sz w:val="19"/>
                 <w:szCs w:val="19"/>
               </w:rPr>
-              <w:t xml:space="preserve">Q 63</w:t>
+              <w:t xml:space="preserve">Q 83</w:t>
             </w:r>
           </w:p>
         </w:tc>
@@ -1126,7 +1126,7 @@
                 <w:sz w:val="19"/>
                 <w:szCs w:val="19"/>
               </w:rPr>
-              <w:t xml:space="preserve">Q 115 − Q 32 − Q 20</w:t>
+              <w:t xml:space="preserve">Q 135 − Q 32 − Q 20</w:t>
             </w:r>
           </w:p>
         </w:tc>
@@ -1304,7 +1304,7 @@
                 <w:sz w:val="19"/>
                 <w:szCs w:val="19"/>
               </w:rPr>
-              <w:t xml:space="preserve">≈ 75 trabajos al mes</w:t>
+              <w:t xml:space="preserve">≈ 57 trabajos al mes</w:t>
             </w:r>
           </w:p>
         </w:tc>
@@ -1337,7 +1337,7 @@
                 <w:sz w:val="19"/>
                 <w:szCs w:val="19"/>
               </w:rPr>
-              <w:t xml:space="preserve">Q 4,700 ÷ Q 63</w:t>
+              <w:t xml:space="preserve">Q 4,700 ÷ Q 83 · meta del piloto: 75</w:t>
             </w:r>
           </w:p>
         </w:tc>
@@ -1726,7 +1726,7 @@
                 <w:sz w:val="19"/>
                 <w:szCs w:val="19"/>
               </w:rPr>
-              <w:t xml:space="preserve">≈ Q 840 M / Q 210 M / Q 0.9 M al año</w:t>
+              <w:t xml:space="preserve">≈ Q 745 M / Q 186 M / Q 0.9 M al año</w:t>
             </w:r>
           </w:p>
         </w:tc>
@@ -1759,7 +1759,7 @@
                 <w:sz w:val="19"/>
                 <w:szCs w:val="19"/>
               </w:rPr>
-              <w:t xml:space="preserve">Estimación con Censo 2018 y la encuesta</w:t>
+              <w:t xml:space="preserve">662,000 hogares (Censo 2018) y la encuesta</w:t>
             </w:r>
           </w:p>
         </w:tc>

</xml_diff>